<commit_message>
在 TAS2O_Specific_Expectations_Verification_Matrix.md 里补了官方 A1.7，总行数现在是 25。
在 TAS2O_Unit_Plans_Webtree_2026.docx 里把 A1.7 写进了 Unit 1 和 Unit 5 的学生任务描述。

在 TAS2O_Major_Assignments_Package_Webtree_2026.docx 里把 A1.7 同步进了 Unit 1 和 Unit 5 的任务说明与课程连接。

在 TAS2O_Rubrics_Package_Webtree_2026.docx 里把 Unit 5 量规补成了 source-synthesis 取向，加入 community / interview source 证据要求。

在 TAS2O_Indigenous_Integration_Evidence_Addendum.md 里加了 Unit 5 的整合点和研究日志要求。

在 TAS2O_Unit_5_Canadian_Innovation_Case_Study_Sample_Page.md 里加了 A1.7 的 source-synthesis 说明。

在 README.txt 里把状态改成更保守的 Internal pre-inspection review，并把 binder 状态改成 Formal submission pending。

另外把 TAS2O_Specific_Expectations_Verification_Matrix.md 里的 A2.7 状态也改成了 mapped。
</commit_message>
<xml_diff>
--- a/01_Course_Core/TAS2O_Unit_Plans_Webtree_2026.docx
+++ b/01_Course_Core/TAS2O_Unit_Plans_Webtree_2026.docx
@@ -1151,7 +1151,7 @@
           </w:tcPr>
           <w:p>
             <w:r>
-              <w:t>Students learn how technology courses operate safely and responsibly. They are introduced to the engineering design process, basic tools, classroom safety expectations, PPE, risk assessment, and responsible use of approved AI tools as a learning assistant. Specific expectation focus: A1.1-A1.4, A4, B2, and B3 through safety routines, design communication, and a small design challenge.</w:t>
+              <w:t>Students learn how technology courses operate safely and responsibly. They are introduced to the engineering design process, basic tools, classroom safety expectations, PPE, risk assessment, and responsible use of approved AI tools as a learning assistant. Specific expectation focus: A1.1-A1.4, A1.7, A4, B2, and B3 through safety routines, design communication, a small design challenge, and a short community-perspective research check.</w:t>
             </w:r>
           </w:p>
         </w:tc>
@@ -5007,7 +5007,7 @@
           </w:tcPr>
           <w:p>
             <w:r>
-              <w:t>Students connect technological development to sustainability, society, workplaces, and career pathways. They research skilled trades, apprenticeship, college pathways, technology roles, and the future impact of AI and automation. Specific expectation focus: A1, B1, B2, and B3 through sustainability analysis and career/pathway investigation.</w:t>
+              <w:t>Students connect technological development to sustainability, society, workplaces, and career pathways. They research skilled trades, apprenticeship, college pathways, technology roles, and the future impact of AI and automation. Specific expectation focus: A1, A1.7, B1, B2, and B3 through sustainability analysis, community-source research, and career/pathway investigation.</w:t>
             </w:r>
           </w:p>
         </w:tc>

</xml_diff>